<commit_message>
docs: enlace al repositorio de GitHub en README y documento
Co-Authored-By: Claude Opus 5.5 (1M context) <noreply@anthropic.com>
</commit_message>
<xml_diff>
--- a/docs/AsistenteIA_Documentacion.docx
+++ b/docs/AsistenteIA_Documentacion.docx
@@ -223,6 +223,31 @@
     </w:p>
     <w:p>
       <w:pPr>
+        <w:spacing w:before="300"/>
+        <w:jc w:val="center"/>
+      </w:pPr>
+      <w:r>
+        <w:rPr>
+          <w:b/>
+          <w:bCs/>
+          <w:sz w:val="22"/>
+          <w:szCs w:val="22"/>
+        </w:rPr>
+        <w:t xml:space="preserve">Repositorio: </w:t>
+      </w:r>
+      <w:hyperlink w:history="1" r:id="rIdftpjirycz2_jg8sgirq7f">
+        <w:r>
+          <w:rPr>
+            <w:rStyle w:val="Hyperlink"/>
+            <w:sz w:val="22"/>
+            <w:szCs w:val="22"/>
+          </w:rPr>
+          <w:t xml:space="preserve">https://github.com/CristianmMst/AsistenteIA</w:t>
+        </w:r>
+      </w:hyperlink>
+    </w:p>
+    <w:p>
+      <w:pPr>
         <w:pageBreakBefore/>
         <w:spacing w:after="200"/>
       </w:pPr>
@@ -4945,6 +4970,26 @@
       <w:r>
         <w:t xml:space="preserve">3.3 Flujo de trabajo con Git</w:t>
       </w:r>
+    </w:p>
+    <w:p>
+      <w:pPr>
+        <w:spacing w:after="120"/>
+      </w:pPr>
+      <w:r>
+        <w:rPr>
+          <w:b/>
+          <w:bCs/>
+        </w:rPr>
+        <w:t xml:space="preserve">Repositorio público: </w:t>
+      </w:r>
+      <w:hyperlink w:history="1" r:id="rIdbr76pycczwp_smxkv81yx">
+        <w:r>
+          <w:rPr>
+            <w:rStyle w:val="Hyperlink"/>
+          </w:rPr>
+          <w:t xml:space="preserve">https://github.com/CristianmMst/AsistenteIA</w:t>
+        </w:r>
+      </w:hyperlink>
     </w:p>
     <w:p>
       <w:pPr>
@@ -23682,7 +23727,7 @@
           <w:sz w:val="16"/>
           <w:szCs w:val="16"/>
         </w:rPr>
-        <w:t xml:space="preserve">git clone &lt;url-del-repositorio&gt;</w:t>
+        <w:t xml:space="preserve">git clone https://github.com/CristianmMst/AsistenteIA.git</w:t>
       </w:r>
     </w:p>
     <w:p>
@@ -24289,7 +24334,7 @@
         <w:spacing w:after="120" w:line="276"/>
       </w:pPr>
       <w:r>
-        <w:t xml:space="preserve">Se entrega el repositorio y un .zip del código fuente sin carpetas bin, obj ni .vs (generado con </w:t>
+        <w:t xml:space="preserve">Se entrega el repositorio (https://github.com/CristianmMst/AsistenteIA) y un .zip del código fuente sin carpetas bin, obj ni .vs (generado con </w:t>
       </w:r>
       <w:r>
         <w:rPr>
@@ -26063,7 +26108,7 @@
                 <w:sz w:val="17"/>
                 <w:szCs w:val="17"/>
               </w:rPr>
-              <w:t xml:space="preserve">Este documento, README y docs/.</w:t>
+              <w:t xml:space="preserve">Este documento, README, docs/ y github.com/CristianmMst/AsistenteIA.</w:t>
             </w:r>
           </w:p>
         </w:tc>

</xml_diff>